<commit_message>
feat: ajout du déplacement
</commit_message>
<xml_diff>
--- a/CDC-Space-Invaders.docx
+++ b/CDC-Space-Invaders.docx
@@ -31,7 +31,21 @@
           <w:sz w:val="56"/>
           <w:szCs w:val="56"/>
         </w:rPr>
-        <w:t>Space Invaders en C# orienté Objet</w:t>
+        <w:t xml:space="preserve">Space Invaders en C# </w:t>
+      </w:r>
+      <w:r>
+        <w:rPr>
+          <w:sz w:val="56"/>
+          <w:szCs w:val="56"/>
+        </w:rPr>
+        <w:t>O</w:t>
+      </w:r>
+      <w:r>
+        <w:rPr>
+          <w:sz w:val="56"/>
+          <w:szCs w:val="56"/>
+        </w:rPr>
+        <w:t>rienté Objet</w:t>
       </w:r>
     </w:p>
     <w:p>
@@ -268,12 +282,191 @@
       <w:r>
         <w:t xml:space="preserve">3 </w:t>
       </w:r>
-      <w:proofErr w:type="spellStart"/>
-      <w:r>
-        <w:t>coeur</w:t>
-      </w:r>
-      <w:proofErr w:type="spellEnd"/>
-    </w:p>
+      <w:r>
+        <w:t>cœurs</w:t>
+      </w:r>
+    </w:p>
+    <w:p>
+      <w:pPr>
+        <w:pStyle w:val="Paragraphedeliste"/>
+        <w:numPr>
+          <w:ilvl w:val="0"/>
+          <w:numId w:val="1"/>
+        </w:numPr>
+      </w:pPr>
+      <w:r>
+        <w:t>Menu</w:t>
+      </w:r>
+    </w:p>
+    <w:p/>
+    <w:p>
+      <w:r>
+        <w:t>Le but du jeu</w:t>
+      </w:r>
+    </w:p>
+    <w:p>
+      <w:pPr>
+        <w:numPr>
+          <w:ilvl w:val="0"/>
+          <w:numId w:val="2"/>
+        </w:numPr>
+      </w:pPr>
+      <w:r>
+        <w:rPr>
+          <w:b/>
+          <w:bCs/>
+        </w:rPr>
+        <w:t>Éliminer les extraterrestres</w:t>
+      </w:r>
+      <w:r>
+        <w:t xml:space="preserve"> : Détruisez toute la grille d'aliens qui descend progressivement vers le bas de l'écran.</w:t>
+      </w:r>
+    </w:p>
+    <w:p>
+      <w:r>
+        <w:t>Les commandes et déplacements</w:t>
+      </w:r>
+    </w:p>
+    <w:p>
+      <w:pPr>
+        <w:numPr>
+          <w:ilvl w:val="0"/>
+          <w:numId w:val="3"/>
+        </w:numPr>
+      </w:pPr>
+      <w:r>
+        <w:rPr>
+          <w:b/>
+          <w:bCs/>
+        </w:rPr>
+        <w:t>Se déplacer</w:t>
+      </w:r>
+      <w:r>
+        <w:t xml:space="preserve"> : Vous dirigez un canon laser horizontalement (de gauche à droite) tout en bas de l'écran.</w:t>
+      </w:r>
+    </w:p>
+    <w:p>
+      <w:pPr>
+        <w:numPr>
+          <w:ilvl w:val="0"/>
+          <w:numId w:val="3"/>
+        </w:numPr>
+      </w:pPr>
+      <w:r>
+        <w:rPr>
+          <w:b/>
+          <w:bCs/>
+        </w:rPr>
+        <w:t>Tirer</w:t>
+      </w:r>
+      <w:r>
+        <w:t xml:space="preserve"> : Vous pouvez envoyer un seul tir vertical à la fois. Il faut attendre qu'il touche sa cible ou sorte de l'écran pour tirer à nouveau. </w:t>
+      </w:r>
+    </w:p>
+    <w:p>
+      <w:r>
+        <w:t>Les dangers et obstacles</w:t>
+      </w:r>
+    </w:p>
+    <w:p>
+      <w:pPr>
+        <w:numPr>
+          <w:ilvl w:val="0"/>
+          <w:numId w:val="4"/>
+        </w:numPr>
+      </w:pPr>
+      <w:r>
+        <w:rPr>
+          <w:b/>
+          <w:bCs/>
+        </w:rPr>
+        <w:t>La riposte ennemie</w:t>
+      </w:r>
+      <w:r>
+        <w:t xml:space="preserve"> : Les extraterrestres ripostent en vous tirant dessus.</w:t>
+      </w:r>
+    </w:p>
+    <w:p>
+      <w:pPr>
+        <w:numPr>
+          <w:ilvl w:val="0"/>
+          <w:numId w:val="4"/>
+        </w:numPr>
+      </w:pPr>
+      <w:r>
+        <w:rPr>
+          <w:b/>
+          <w:bCs/>
+        </w:rPr>
+        <w:t>La défaite</w:t>
+      </w:r>
+      <w:r>
+        <w:t xml:space="preserve"> : Vous perdez une vie si un tir ennemi vous touche, ou si les aliens descendent jusqu'en bas de l'écran sans que vous n'ayez pu les arrêter</w:t>
+      </w:r>
+    </w:p>
+    <w:p>
+      <w:r>
+        <w:t>Le but du jeu</w:t>
+      </w:r>
+    </w:p>
+    <w:p>
+      <w:pPr>
+        <w:numPr>
+          <w:ilvl w:val="0"/>
+          <w:numId w:val="5"/>
+        </w:numPr>
+      </w:pPr>
+      <w:r>
+        <w:rPr>
+          <w:b/>
+          <w:bCs/>
+        </w:rPr>
+        <w:t>Éliminer les extraterrestres</w:t>
+      </w:r>
+      <w:r>
+        <w:t xml:space="preserve"> : Détruisez toute la grille d'aliens qui descend progressivement vers le bas de l'écran.</w:t>
+      </w:r>
+    </w:p>
+    <w:p>
+      <w:pPr>
+        <w:numPr>
+          <w:ilvl w:val="0"/>
+          <w:numId w:val="5"/>
+        </w:numPr>
+      </w:pPr>
+      <w:r>
+        <w:rPr>
+          <w:b/>
+          <w:bCs/>
+        </w:rPr>
+        <w:t>Marquer des points</w:t>
+      </w:r>
+      <w:r>
+        <w:t xml:space="preserve"> : Chaque alien détruit rapporte des points. Une soucoupe volante mystère (</w:t>
+      </w:r>
+      <w:r>
+        <w:rPr>
+          <w:i/>
+          <w:iCs/>
+        </w:rPr>
+        <w:t>UFO</w:t>
+      </w:r>
+      <w:r>
+        <w:t>) passe parfois en haut de l'écran pour offrir un bonus important.</w:t>
+      </w:r>
+      <w:r>
+        <w:t xml:space="preserve"> (</w:t>
+      </w:r>
+      <w:proofErr w:type="gramStart"/>
+      <w:r>
+        <w:t>si</w:t>
+      </w:r>
+      <w:proofErr w:type="gramEnd"/>
+      <w:r>
+        <w:t xml:space="preserve"> temps le permet)</w:t>
+      </w:r>
+    </w:p>
+    <w:p/>
     <w:sectPr>
       <w:pgSz w:w="11906" w:h="16838"/>
       <w:pgMar w:top="1417" w:right="1417" w:bottom="1417" w:left="1417" w:header="708" w:footer="708" w:gutter="0"/>
@@ -287,6 +480,155 @@
 <file path=word/numbering.xml><?xml version="1.0" encoding="utf-8"?>
 <w:numbering xmlns:wpc="http://schemas.microsoft.com/office/word/2010/wordprocessingCanvas" xmlns:cx="http://schemas.microsoft.com/office/drawing/2014/chartex" xmlns:cx1="http://schemas.microsoft.com/office/drawing/2015/9/8/chartex" xmlns:cx2="http://schemas.microsoft.com/office/drawing/2015/10/21/chartex" xmlns:cx3="http://schemas.microsoft.com/office/drawing/2016/5/9/chartex" xmlns:cx4="http://schemas.microsoft.com/office/drawing/2016/5/10/chartex" xmlns:cx5="http://schemas.microsoft.com/office/drawing/2016/5/11/chartex" xmlns:cx6="http://schemas.microsoft.com/office/drawing/2016/5/12/chartex" xmlns:cx7="http://schemas.microsoft.com/office/drawing/2016/5/13/chartex" xmlns:cx8="http://schemas.microsoft.com/office/drawing/2016/5/14/chartex" xmlns:mc="http://schemas.openxmlformats.org/markup-compatibility/2006" xmlns:aink="http://schemas.microsoft.com/office/drawing/2016/ink" xmlns:am3d="http://schemas.microsoft.com/office/drawing/2017/model3d" xmlns:o="urn:schemas-microsoft-com:office:office" xmlns:oel="http://schemas.microsoft.com/office/2019/extlst" xmlns:r="http://schemas.openxmlformats.org/officeDocument/2006/relationships" xmlns:m="http://schemas.openxmlformats.org/officeDocument/2006/math" xmlns:v="urn:schemas-microsoft-com:vml" xmlns:wp14="http://schemas.microsoft.com/office/word/2010/wordprocessingDrawing" xmlns:wp="http://schemas.openxmlformats.org/drawingml/2006/wordprocessingDrawing" xmlns:w10="urn:schemas-microsoft-com:office:word" xmlns:w="http://schemas.openxmlformats.org/wordprocessingml/2006/main" xmlns:w14="http://schemas.microsoft.com/office/word/2010/wordml" xmlns:w15="http://schemas.microsoft.com/office/word/2012/wordml" xmlns:w16cex="http://schemas.microsoft.com/office/word/2018/wordml/cex" xmlns:w16cid="http://schemas.microsoft.com/office/word/2016/wordml/cid" xmlns:w16="http://schemas.microsoft.com/office/word/2018/wordml" xmlns:w16du="http://schemas.microsoft.com/office/word/2023/wordml/word16du" xmlns:w16sdtdh="http://schemas.microsoft.com/office/word/2020/wordml/sdtdatahash" xmlns:w16sdtfl="http://schemas.microsoft.com/office/word/2024/wordml/sdtformatlock" xmlns:w16se="http://schemas.microsoft.com/office/word/2015/wordml/symex" xmlns:wpg="http://schemas.microsoft.com/office/word/2010/wordprocessingGroup" xmlns:wpi="http://schemas.microsoft.com/office/word/2010/wordprocessingInk" xmlns:wne="http://schemas.microsoft.com/office/word/2006/wordml" xmlns:wps="http://schemas.microsoft.com/office/word/2010/wordprocessingShape" mc:Ignorable="w14 w15 w16se w16cid w16 w16cex w16sdtdh w16sdtfl w16du wp14">
   <w:abstractNum w:abstractNumId="0" w15:restartNumberingAfterBreak="0">
+    <w:nsid w:val="03CD0DAC"/>
+    <w:multiLevelType w:val="multilevel"/>
+    <w:tmpl w:val="78467930"/>
+    <w:lvl w:ilvl="0">
+      <w:start w:val="1"/>
+      <w:numFmt w:val="bullet"/>
+      <w:lvlText w:val=""/>
+      <w:lvlJc w:val="left"/>
+      <w:pPr>
+        <w:tabs>
+          <w:tab w:val="num" w:pos="720"/>
+        </w:tabs>
+        <w:ind w:left="720" w:hanging="360"/>
+      </w:pPr>
+      <w:rPr>
+        <w:rFonts w:ascii="Symbol" w:hAnsi="Symbol" w:hint="default"/>
+        <w:sz w:val="20"/>
+      </w:rPr>
+    </w:lvl>
+    <w:lvl w:ilvl="1" w:tentative="1">
+      <w:start w:val="1"/>
+      <w:numFmt w:val="bullet"/>
+      <w:lvlText w:val="o"/>
+      <w:lvlJc w:val="left"/>
+      <w:pPr>
+        <w:tabs>
+          <w:tab w:val="num" w:pos="1440"/>
+        </w:tabs>
+        <w:ind w:left="1440" w:hanging="360"/>
+      </w:pPr>
+      <w:rPr>
+        <w:rFonts w:ascii="Courier New" w:hAnsi="Courier New" w:hint="default"/>
+        <w:sz w:val="20"/>
+      </w:rPr>
+    </w:lvl>
+    <w:lvl w:ilvl="2" w:tentative="1">
+      <w:start w:val="1"/>
+      <w:numFmt w:val="bullet"/>
+      <w:lvlText w:val=""/>
+      <w:lvlJc w:val="left"/>
+      <w:pPr>
+        <w:tabs>
+          <w:tab w:val="num" w:pos="2160"/>
+        </w:tabs>
+        <w:ind w:left="2160" w:hanging="360"/>
+      </w:pPr>
+      <w:rPr>
+        <w:rFonts w:ascii="Wingdings" w:hAnsi="Wingdings" w:hint="default"/>
+        <w:sz w:val="20"/>
+      </w:rPr>
+    </w:lvl>
+    <w:lvl w:ilvl="3" w:tentative="1">
+      <w:start w:val="1"/>
+      <w:numFmt w:val="bullet"/>
+      <w:lvlText w:val=""/>
+      <w:lvlJc w:val="left"/>
+      <w:pPr>
+        <w:tabs>
+          <w:tab w:val="num" w:pos="2880"/>
+        </w:tabs>
+        <w:ind w:left="2880" w:hanging="360"/>
+      </w:pPr>
+      <w:rPr>
+        <w:rFonts w:ascii="Wingdings" w:hAnsi="Wingdings" w:hint="default"/>
+        <w:sz w:val="20"/>
+      </w:rPr>
+    </w:lvl>
+    <w:lvl w:ilvl="4" w:tentative="1">
+      <w:start w:val="1"/>
+      <w:numFmt w:val="bullet"/>
+      <w:lvlText w:val=""/>
+      <w:lvlJc w:val="left"/>
+      <w:pPr>
+        <w:tabs>
+          <w:tab w:val="num" w:pos="3600"/>
+        </w:tabs>
+        <w:ind w:left="3600" w:hanging="360"/>
+      </w:pPr>
+      <w:rPr>
+        <w:rFonts w:ascii="Wingdings" w:hAnsi="Wingdings" w:hint="default"/>
+        <w:sz w:val="20"/>
+      </w:rPr>
+    </w:lvl>
+    <w:lvl w:ilvl="5" w:tentative="1">
+      <w:start w:val="1"/>
+      <w:numFmt w:val="bullet"/>
+      <w:lvlText w:val=""/>
+      <w:lvlJc w:val="left"/>
+      <w:pPr>
+        <w:tabs>
+          <w:tab w:val="num" w:pos="4320"/>
+        </w:tabs>
+        <w:ind w:left="4320" w:hanging="360"/>
+      </w:pPr>
+      <w:rPr>
+        <w:rFonts w:ascii="Wingdings" w:hAnsi="Wingdings" w:hint="default"/>
+        <w:sz w:val="20"/>
+      </w:rPr>
+    </w:lvl>
+    <w:lvl w:ilvl="6" w:tentative="1">
+      <w:start w:val="1"/>
+      <w:numFmt w:val="bullet"/>
+      <w:lvlText w:val=""/>
+      <w:lvlJc w:val="left"/>
+      <w:pPr>
+        <w:tabs>
+          <w:tab w:val="num" w:pos="5040"/>
+        </w:tabs>
+        <w:ind w:left="5040" w:hanging="360"/>
+      </w:pPr>
+      <w:rPr>
+        <w:rFonts w:ascii="Wingdings" w:hAnsi="Wingdings" w:hint="default"/>
+        <w:sz w:val="20"/>
+      </w:rPr>
+    </w:lvl>
+    <w:lvl w:ilvl="7" w:tentative="1">
+      <w:start w:val="1"/>
+      <w:numFmt w:val="bullet"/>
+      <w:lvlText w:val=""/>
+      <w:lvlJc w:val="left"/>
+      <w:pPr>
+        <w:tabs>
+          <w:tab w:val="num" w:pos="5760"/>
+        </w:tabs>
+        <w:ind w:left="5760" w:hanging="360"/>
+      </w:pPr>
+      <w:rPr>
+        <w:rFonts w:ascii="Wingdings" w:hAnsi="Wingdings" w:hint="default"/>
+        <w:sz w:val="20"/>
+      </w:rPr>
+    </w:lvl>
+    <w:lvl w:ilvl="8" w:tentative="1">
+      <w:start w:val="1"/>
+      <w:numFmt w:val="bullet"/>
+      <w:lvlText w:val=""/>
+      <w:lvlJc w:val="left"/>
+      <w:pPr>
+        <w:tabs>
+          <w:tab w:val="num" w:pos="6480"/>
+        </w:tabs>
+        <w:ind w:left="6480" w:hanging="360"/>
+      </w:pPr>
+      <w:rPr>
+        <w:rFonts w:ascii="Wingdings" w:hAnsi="Wingdings" w:hint="default"/>
+        <w:sz w:val="20"/>
+      </w:rPr>
+    </w:lvl>
+  </w:abstractNum>
+  <w:abstractNum w:abstractNumId="1" w15:restartNumberingAfterBreak="0">
     <w:nsid w:val="1E0A201F"/>
     <w:multiLevelType w:val="hybridMultilevel"/>
     <w:tmpl w:val="A7EEFD78"/>
@@ -398,8 +740,771 @@
       </w:rPr>
     </w:lvl>
   </w:abstractNum>
+  <w:abstractNum w:abstractNumId="2" w15:restartNumberingAfterBreak="0">
+    <w:nsid w:val="329E0CEA"/>
+    <w:multiLevelType w:val="multilevel"/>
+    <w:tmpl w:val="3EB8712C"/>
+    <w:lvl w:ilvl="0">
+      <w:start w:val="1"/>
+      <w:numFmt w:val="bullet"/>
+      <w:lvlText w:val=""/>
+      <w:lvlJc w:val="left"/>
+      <w:pPr>
+        <w:tabs>
+          <w:tab w:val="num" w:pos="720"/>
+        </w:tabs>
+        <w:ind w:left="720" w:hanging="360"/>
+      </w:pPr>
+      <w:rPr>
+        <w:rFonts w:ascii="Symbol" w:hAnsi="Symbol" w:hint="default"/>
+        <w:sz w:val="20"/>
+      </w:rPr>
+    </w:lvl>
+    <w:lvl w:ilvl="1" w:tentative="1">
+      <w:start w:val="1"/>
+      <w:numFmt w:val="bullet"/>
+      <w:lvlText w:val="o"/>
+      <w:lvlJc w:val="left"/>
+      <w:pPr>
+        <w:tabs>
+          <w:tab w:val="num" w:pos="1440"/>
+        </w:tabs>
+        <w:ind w:left="1440" w:hanging="360"/>
+      </w:pPr>
+      <w:rPr>
+        <w:rFonts w:ascii="Courier New" w:hAnsi="Courier New" w:hint="default"/>
+        <w:sz w:val="20"/>
+      </w:rPr>
+    </w:lvl>
+    <w:lvl w:ilvl="2" w:tentative="1">
+      <w:start w:val="1"/>
+      <w:numFmt w:val="bullet"/>
+      <w:lvlText w:val=""/>
+      <w:lvlJc w:val="left"/>
+      <w:pPr>
+        <w:tabs>
+          <w:tab w:val="num" w:pos="2160"/>
+        </w:tabs>
+        <w:ind w:left="2160" w:hanging="360"/>
+      </w:pPr>
+      <w:rPr>
+        <w:rFonts w:ascii="Wingdings" w:hAnsi="Wingdings" w:hint="default"/>
+        <w:sz w:val="20"/>
+      </w:rPr>
+    </w:lvl>
+    <w:lvl w:ilvl="3" w:tentative="1">
+      <w:start w:val="1"/>
+      <w:numFmt w:val="bullet"/>
+      <w:lvlText w:val=""/>
+      <w:lvlJc w:val="left"/>
+      <w:pPr>
+        <w:tabs>
+          <w:tab w:val="num" w:pos="2880"/>
+        </w:tabs>
+        <w:ind w:left="2880" w:hanging="360"/>
+      </w:pPr>
+      <w:rPr>
+        <w:rFonts w:ascii="Wingdings" w:hAnsi="Wingdings" w:hint="default"/>
+        <w:sz w:val="20"/>
+      </w:rPr>
+    </w:lvl>
+    <w:lvl w:ilvl="4" w:tentative="1">
+      <w:start w:val="1"/>
+      <w:numFmt w:val="bullet"/>
+      <w:lvlText w:val=""/>
+      <w:lvlJc w:val="left"/>
+      <w:pPr>
+        <w:tabs>
+          <w:tab w:val="num" w:pos="3600"/>
+        </w:tabs>
+        <w:ind w:left="3600" w:hanging="360"/>
+      </w:pPr>
+      <w:rPr>
+        <w:rFonts w:ascii="Wingdings" w:hAnsi="Wingdings" w:hint="default"/>
+        <w:sz w:val="20"/>
+      </w:rPr>
+    </w:lvl>
+    <w:lvl w:ilvl="5" w:tentative="1">
+      <w:start w:val="1"/>
+      <w:numFmt w:val="bullet"/>
+      <w:lvlText w:val=""/>
+      <w:lvlJc w:val="left"/>
+      <w:pPr>
+        <w:tabs>
+          <w:tab w:val="num" w:pos="4320"/>
+        </w:tabs>
+        <w:ind w:left="4320" w:hanging="360"/>
+      </w:pPr>
+      <w:rPr>
+        <w:rFonts w:ascii="Wingdings" w:hAnsi="Wingdings" w:hint="default"/>
+        <w:sz w:val="20"/>
+      </w:rPr>
+    </w:lvl>
+    <w:lvl w:ilvl="6" w:tentative="1">
+      <w:start w:val="1"/>
+      <w:numFmt w:val="bullet"/>
+      <w:lvlText w:val=""/>
+      <w:lvlJc w:val="left"/>
+      <w:pPr>
+        <w:tabs>
+          <w:tab w:val="num" w:pos="5040"/>
+        </w:tabs>
+        <w:ind w:left="5040" w:hanging="360"/>
+      </w:pPr>
+      <w:rPr>
+        <w:rFonts w:ascii="Wingdings" w:hAnsi="Wingdings" w:hint="default"/>
+        <w:sz w:val="20"/>
+      </w:rPr>
+    </w:lvl>
+    <w:lvl w:ilvl="7" w:tentative="1">
+      <w:start w:val="1"/>
+      <w:numFmt w:val="bullet"/>
+      <w:lvlText w:val=""/>
+      <w:lvlJc w:val="left"/>
+      <w:pPr>
+        <w:tabs>
+          <w:tab w:val="num" w:pos="5760"/>
+        </w:tabs>
+        <w:ind w:left="5760" w:hanging="360"/>
+      </w:pPr>
+      <w:rPr>
+        <w:rFonts w:ascii="Wingdings" w:hAnsi="Wingdings" w:hint="default"/>
+        <w:sz w:val="20"/>
+      </w:rPr>
+    </w:lvl>
+    <w:lvl w:ilvl="8" w:tentative="1">
+      <w:start w:val="1"/>
+      <w:numFmt w:val="bullet"/>
+      <w:lvlText w:val=""/>
+      <w:lvlJc w:val="left"/>
+      <w:pPr>
+        <w:tabs>
+          <w:tab w:val="num" w:pos="6480"/>
+        </w:tabs>
+        <w:ind w:left="6480" w:hanging="360"/>
+      </w:pPr>
+      <w:rPr>
+        <w:rFonts w:ascii="Wingdings" w:hAnsi="Wingdings" w:hint="default"/>
+        <w:sz w:val="20"/>
+      </w:rPr>
+    </w:lvl>
+  </w:abstractNum>
+  <w:abstractNum w:abstractNumId="3" w15:restartNumberingAfterBreak="0">
+    <w:nsid w:val="584641D5"/>
+    <w:multiLevelType w:val="multilevel"/>
+    <w:tmpl w:val="B7F02298"/>
+    <w:lvl w:ilvl="0">
+      <w:start w:val="1"/>
+      <w:numFmt w:val="bullet"/>
+      <w:lvlText w:val=""/>
+      <w:lvlJc w:val="left"/>
+      <w:pPr>
+        <w:tabs>
+          <w:tab w:val="num" w:pos="720"/>
+        </w:tabs>
+        <w:ind w:left="720" w:hanging="360"/>
+      </w:pPr>
+      <w:rPr>
+        <w:rFonts w:ascii="Symbol" w:hAnsi="Symbol" w:hint="default"/>
+        <w:sz w:val="20"/>
+      </w:rPr>
+    </w:lvl>
+    <w:lvl w:ilvl="1" w:tentative="1">
+      <w:start w:val="1"/>
+      <w:numFmt w:val="bullet"/>
+      <w:lvlText w:val="o"/>
+      <w:lvlJc w:val="left"/>
+      <w:pPr>
+        <w:tabs>
+          <w:tab w:val="num" w:pos="1440"/>
+        </w:tabs>
+        <w:ind w:left="1440" w:hanging="360"/>
+      </w:pPr>
+      <w:rPr>
+        <w:rFonts w:ascii="Courier New" w:hAnsi="Courier New" w:hint="default"/>
+        <w:sz w:val="20"/>
+      </w:rPr>
+    </w:lvl>
+    <w:lvl w:ilvl="2" w:tentative="1">
+      <w:start w:val="1"/>
+      <w:numFmt w:val="bullet"/>
+      <w:lvlText w:val=""/>
+      <w:lvlJc w:val="left"/>
+      <w:pPr>
+        <w:tabs>
+          <w:tab w:val="num" w:pos="2160"/>
+        </w:tabs>
+        <w:ind w:left="2160" w:hanging="360"/>
+      </w:pPr>
+      <w:rPr>
+        <w:rFonts w:ascii="Wingdings" w:hAnsi="Wingdings" w:hint="default"/>
+        <w:sz w:val="20"/>
+      </w:rPr>
+    </w:lvl>
+    <w:lvl w:ilvl="3" w:tentative="1">
+      <w:start w:val="1"/>
+      <w:numFmt w:val="bullet"/>
+      <w:lvlText w:val=""/>
+      <w:lvlJc w:val="left"/>
+      <w:pPr>
+        <w:tabs>
+          <w:tab w:val="num" w:pos="2880"/>
+        </w:tabs>
+        <w:ind w:left="2880" w:hanging="360"/>
+      </w:pPr>
+      <w:rPr>
+        <w:rFonts w:ascii="Wingdings" w:hAnsi="Wingdings" w:hint="default"/>
+        <w:sz w:val="20"/>
+      </w:rPr>
+    </w:lvl>
+    <w:lvl w:ilvl="4" w:tentative="1">
+      <w:start w:val="1"/>
+      <w:numFmt w:val="bullet"/>
+      <w:lvlText w:val=""/>
+      <w:lvlJc w:val="left"/>
+      <w:pPr>
+        <w:tabs>
+          <w:tab w:val="num" w:pos="3600"/>
+        </w:tabs>
+        <w:ind w:left="3600" w:hanging="360"/>
+      </w:pPr>
+      <w:rPr>
+        <w:rFonts w:ascii="Wingdings" w:hAnsi="Wingdings" w:hint="default"/>
+        <w:sz w:val="20"/>
+      </w:rPr>
+    </w:lvl>
+    <w:lvl w:ilvl="5" w:tentative="1">
+      <w:start w:val="1"/>
+      <w:numFmt w:val="bullet"/>
+      <w:lvlText w:val=""/>
+      <w:lvlJc w:val="left"/>
+      <w:pPr>
+        <w:tabs>
+          <w:tab w:val="num" w:pos="4320"/>
+        </w:tabs>
+        <w:ind w:left="4320" w:hanging="360"/>
+      </w:pPr>
+      <w:rPr>
+        <w:rFonts w:ascii="Wingdings" w:hAnsi="Wingdings" w:hint="default"/>
+        <w:sz w:val="20"/>
+      </w:rPr>
+    </w:lvl>
+    <w:lvl w:ilvl="6" w:tentative="1">
+      <w:start w:val="1"/>
+      <w:numFmt w:val="bullet"/>
+      <w:lvlText w:val=""/>
+      <w:lvlJc w:val="left"/>
+      <w:pPr>
+        <w:tabs>
+          <w:tab w:val="num" w:pos="5040"/>
+        </w:tabs>
+        <w:ind w:left="5040" w:hanging="360"/>
+      </w:pPr>
+      <w:rPr>
+        <w:rFonts w:ascii="Wingdings" w:hAnsi="Wingdings" w:hint="default"/>
+        <w:sz w:val="20"/>
+      </w:rPr>
+    </w:lvl>
+    <w:lvl w:ilvl="7" w:tentative="1">
+      <w:start w:val="1"/>
+      <w:numFmt w:val="bullet"/>
+      <w:lvlText w:val=""/>
+      <w:lvlJc w:val="left"/>
+      <w:pPr>
+        <w:tabs>
+          <w:tab w:val="num" w:pos="5760"/>
+        </w:tabs>
+        <w:ind w:left="5760" w:hanging="360"/>
+      </w:pPr>
+      <w:rPr>
+        <w:rFonts w:ascii="Wingdings" w:hAnsi="Wingdings" w:hint="default"/>
+        <w:sz w:val="20"/>
+      </w:rPr>
+    </w:lvl>
+    <w:lvl w:ilvl="8" w:tentative="1">
+      <w:start w:val="1"/>
+      <w:numFmt w:val="bullet"/>
+      <w:lvlText w:val=""/>
+      <w:lvlJc w:val="left"/>
+      <w:pPr>
+        <w:tabs>
+          <w:tab w:val="num" w:pos="6480"/>
+        </w:tabs>
+        <w:ind w:left="6480" w:hanging="360"/>
+      </w:pPr>
+      <w:rPr>
+        <w:rFonts w:ascii="Wingdings" w:hAnsi="Wingdings" w:hint="default"/>
+        <w:sz w:val="20"/>
+      </w:rPr>
+    </w:lvl>
+  </w:abstractNum>
+  <w:abstractNum w:abstractNumId="4" w15:restartNumberingAfterBreak="0">
+    <w:nsid w:val="5F74364F"/>
+    <w:multiLevelType w:val="multilevel"/>
+    <w:tmpl w:val="4B963716"/>
+    <w:lvl w:ilvl="0">
+      <w:start w:val="1"/>
+      <w:numFmt w:val="bullet"/>
+      <w:lvlText w:val=""/>
+      <w:lvlJc w:val="left"/>
+      <w:pPr>
+        <w:tabs>
+          <w:tab w:val="num" w:pos="720"/>
+        </w:tabs>
+        <w:ind w:left="720" w:hanging="360"/>
+      </w:pPr>
+      <w:rPr>
+        <w:rFonts w:ascii="Symbol" w:hAnsi="Symbol" w:hint="default"/>
+        <w:sz w:val="20"/>
+      </w:rPr>
+    </w:lvl>
+    <w:lvl w:ilvl="1" w:tentative="1">
+      <w:start w:val="1"/>
+      <w:numFmt w:val="bullet"/>
+      <w:lvlText w:val="o"/>
+      <w:lvlJc w:val="left"/>
+      <w:pPr>
+        <w:tabs>
+          <w:tab w:val="num" w:pos="1440"/>
+        </w:tabs>
+        <w:ind w:left="1440" w:hanging="360"/>
+      </w:pPr>
+      <w:rPr>
+        <w:rFonts w:ascii="Courier New" w:hAnsi="Courier New" w:hint="default"/>
+        <w:sz w:val="20"/>
+      </w:rPr>
+    </w:lvl>
+    <w:lvl w:ilvl="2" w:tentative="1">
+      <w:start w:val="1"/>
+      <w:numFmt w:val="bullet"/>
+      <w:lvlText w:val=""/>
+      <w:lvlJc w:val="left"/>
+      <w:pPr>
+        <w:tabs>
+          <w:tab w:val="num" w:pos="2160"/>
+        </w:tabs>
+        <w:ind w:left="2160" w:hanging="360"/>
+      </w:pPr>
+      <w:rPr>
+        <w:rFonts w:ascii="Wingdings" w:hAnsi="Wingdings" w:hint="default"/>
+        <w:sz w:val="20"/>
+      </w:rPr>
+    </w:lvl>
+    <w:lvl w:ilvl="3" w:tentative="1">
+      <w:start w:val="1"/>
+      <w:numFmt w:val="bullet"/>
+      <w:lvlText w:val=""/>
+      <w:lvlJc w:val="left"/>
+      <w:pPr>
+        <w:tabs>
+          <w:tab w:val="num" w:pos="2880"/>
+        </w:tabs>
+        <w:ind w:left="2880" w:hanging="360"/>
+      </w:pPr>
+      <w:rPr>
+        <w:rFonts w:ascii="Wingdings" w:hAnsi="Wingdings" w:hint="default"/>
+        <w:sz w:val="20"/>
+      </w:rPr>
+    </w:lvl>
+    <w:lvl w:ilvl="4" w:tentative="1">
+      <w:start w:val="1"/>
+      <w:numFmt w:val="bullet"/>
+      <w:lvlText w:val=""/>
+      <w:lvlJc w:val="left"/>
+      <w:pPr>
+        <w:tabs>
+          <w:tab w:val="num" w:pos="3600"/>
+        </w:tabs>
+        <w:ind w:left="3600" w:hanging="360"/>
+      </w:pPr>
+      <w:rPr>
+        <w:rFonts w:ascii="Wingdings" w:hAnsi="Wingdings" w:hint="default"/>
+        <w:sz w:val="20"/>
+      </w:rPr>
+    </w:lvl>
+    <w:lvl w:ilvl="5" w:tentative="1">
+      <w:start w:val="1"/>
+      <w:numFmt w:val="bullet"/>
+      <w:lvlText w:val=""/>
+      <w:lvlJc w:val="left"/>
+      <w:pPr>
+        <w:tabs>
+          <w:tab w:val="num" w:pos="4320"/>
+        </w:tabs>
+        <w:ind w:left="4320" w:hanging="360"/>
+      </w:pPr>
+      <w:rPr>
+        <w:rFonts w:ascii="Wingdings" w:hAnsi="Wingdings" w:hint="default"/>
+        <w:sz w:val="20"/>
+      </w:rPr>
+    </w:lvl>
+    <w:lvl w:ilvl="6" w:tentative="1">
+      <w:start w:val="1"/>
+      <w:numFmt w:val="bullet"/>
+      <w:lvlText w:val=""/>
+      <w:lvlJc w:val="left"/>
+      <w:pPr>
+        <w:tabs>
+          <w:tab w:val="num" w:pos="5040"/>
+        </w:tabs>
+        <w:ind w:left="5040" w:hanging="360"/>
+      </w:pPr>
+      <w:rPr>
+        <w:rFonts w:ascii="Wingdings" w:hAnsi="Wingdings" w:hint="default"/>
+        <w:sz w:val="20"/>
+      </w:rPr>
+    </w:lvl>
+    <w:lvl w:ilvl="7" w:tentative="1">
+      <w:start w:val="1"/>
+      <w:numFmt w:val="bullet"/>
+      <w:lvlText w:val=""/>
+      <w:lvlJc w:val="left"/>
+      <w:pPr>
+        <w:tabs>
+          <w:tab w:val="num" w:pos="5760"/>
+        </w:tabs>
+        <w:ind w:left="5760" w:hanging="360"/>
+      </w:pPr>
+      <w:rPr>
+        <w:rFonts w:ascii="Wingdings" w:hAnsi="Wingdings" w:hint="default"/>
+        <w:sz w:val="20"/>
+      </w:rPr>
+    </w:lvl>
+    <w:lvl w:ilvl="8" w:tentative="1">
+      <w:start w:val="1"/>
+      <w:numFmt w:val="bullet"/>
+      <w:lvlText w:val=""/>
+      <w:lvlJc w:val="left"/>
+      <w:pPr>
+        <w:tabs>
+          <w:tab w:val="num" w:pos="6480"/>
+        </w:tabs>
+        <w:ind w:left="6480" w:hanging="360"/>
+      </w:pPr>
+      <w:rPr>
+        <w:rFonts w:ascii="Wingdings" w:hAnsi="Wingdings" w:hint="default"/>
+        <w:sz w:val="20"/>
+      </w:rPr>
+    </w:lvl>
+  </w:abstractNum>
+  <w:abstractNum w:abstractNumId="5" w15:restartNumberingAfterBreak="0">
+    <w:nsid w:val="73EE4907"/>
+    <w:multiLevelType w:val="multilevel"/>
+    <w:tmpl w:val="8C343114"/>
+    <w:lvl w:ilvl="0">
+      <w:start w:val="1"/>
+      <w:numFmt w:val="bullet"/>
+      <w:lvlText w:val=""/>
+      <w:lvlJc w:val="left"/>
+      <w:pPr>
+        <w:tabs>
+          <w:tab w:val="num" w:pos="720"/>
+        </w:tabs>
+        <w:ind w:left="720" w:hanging="360"/>
+      </w:pPr>
+      <w:rPr>
+        <w:rFonts w:ascii="Symbol" w:hAnsi="Symbol" w:hint="default"/>
+        <w:sz w:val="20"/>
+      </w:rPr>
+    </w:lvl>
+    <w:lvl w:ilvl="1" w:tentative="1">
+      <w:start w:val="1"/>
+      <w:numFmt w:val="bullet"/>
+      <w:lvlText w:val="o"/>
+      <w:lvlJc w:val="left"/>
+      <w:pPr>
+        <w:tabs>
+          <w:tab w:val="num" w:pos="1440"/>
+        </w:tabs>
+        <w:ind w:left="1440" w:hanging="360"/>
+      </w:pPr>
+      <w:rPr>
+        <w:rFonts w:ascii="Courier New" w:hAnsi="Courier New" w:hint="default"/>
+        <w:sz w:val="20"/>
+      </w:rPr>
+    </w:lvl>
+    <w:lvl w:ilvl="2" w:tentative="1">
+      <w:start w:val="1"/>
+      <w:numFmt w:val="bullet"/>
+      <w:lvlText w:val=""/>
+      <w:lvlJc w:val="left"/>
+      <w:pPr>
+        <w:tabs>
+          <w:tab w:val="num" w:pos="2160"/>
+        </w:tabs>
+        <w:ind w:left="2160" w:hanging="360"/>
+      </w:pPr>
+      <w:rPr>
+        <w:rFonts w:ascii="Wingdings" w:hAnsi="Wingdings" w:hint="default"/>
+        <w:sz w:val="20"/>
+      </w:rPr>
+    </w:lvl>
+    <w:lvl w:ilvl="3" w:tentative="1">
+      <w:start w:val="1"/>
+      <w:numFmt w:val="bullet"/>
+      <w:lvlText w:val=""/>
+      <w:lvlJc w:val="left"/>
+      <w:pPr>
+        <w:tabs>
+          <w:tab w:val="num" w:pos="2880"/>
+        </w:tabs>
+        <w:ind w:left="2880" w:hanging="360"/>
+      </w:pPr>
+      <w:rPr>
+        <w:rFonts w:ascii="Wingdings" w:hAnsi="Wingdings" w:hint="default"/>
+        <w:sz w:val="20"/>
+      </w:rPr>
+    </w:lvl>
+    <w:lvl w:ilvl="4" w:tentative="1">
+      <w:start w:val="1"/>
+      <w:numFmt w:val="bullet"/>
+      <w:lvlText w:val=""/>
+      <w:lvlJc w:val="left"/>
+      <w:pPr>
+        <w:tabs>
+          <w:tab w:val="num" w:pos="3600"/>
+        </w:tabs>
+        <w:ind w:left="3600" w:hanging="360"/>
+      </w:pPr>
+      <w:rPr>
+        <w:rFonts w:ascii="Wingdings" w:hAnsi="Wingdings" w:hint="default"/>
+        <w:sz w:val="20"/>
+      </w:rPr>
+    </w:lvl>
+    <w:lvl w:ilvl="5" w:tentative="1">
+      <w:start w:val="1"/>
+      <w:numFmt w:val="bullet"/>
+      <w:lvlText w:val=""/>
+      <w:lvlJc w:val="left"/>
+      <w:pPr>
+        <w:tabs>
+          <w:tab w:val="num" w:pos="4320"/>
+        </w:tabs>
+        <w:ind w:left="4320" w:hanging="360"/>
+      </w:pPr>
+      <w:rPr>
+        <w:rFonts w:ascii="Wingdings" w:hAnsi="Wingdings" w:hint="default"/>
+        <w:sz w:val="20"/>
+      </w:rPr>
+    </w:lvl>
+    <w:lvl w:ilvl="6" w:tentative="1">
+      <w:start w:val="1"/>
+      <w:numFmt w:val="bullet"/>
+      <w:lvlText w:val=""/>
+      <w:lvlJc w:val="left"/>
+      <w:pPr>
+        <w:tabs>
+          <w:tab w:val="num" w:pos="5040"/>
+        </w:tabs>
+        <w:ind w:left="5040" w:hanging="360"/>
+      </w:pPr>
+      <w:rPr>
+        <w:rFonts w:ascii="Wingdings" w:hAnsi="Wingdings" w:hint="default"/>
+        <w:sz w:val="20"/>
+      </w:rPr>
+    </w:lvl>
+    <w:lvl w:ilvl="7" w:tentative="1">
+      <w:start w:val="1"/>
+      <w:numFmt w:val="bullet"/>
+      <w:lvlText w:val=""/>
+      <w:lvlJc w:val="left"/>
+      <w:pPr>
+        <w:tabs>
+          <w:tab w:val="num" w:pos="5760"/>
+        </w:tabs>
+        <w:ind w:left="5760" w:hanging="360"/>
+      </w:pPr>
+      <w:rPr>
+        <w:rFonts w:ascii="Wingdings" w:hAnsi="Wingdings" w:hint="default"/>
+        <w:sz w:val="20"/>
+      </w:rPr>
+    </w:lvl>
+    <w:lvl w:ilvl="8" w:tentative="1">
+      <w:start w:val="1"/>
+      <w:numFmt w:val="bullet"/>
+      <w:lvlText w:val=""/>
+      <w:lvlJc w:val="left"/>
+      <w:pPr>
+        <w:tabs>
+          <w:tab w:val="num" w:pos="6480"/>
+        </w:tabs>
+        <w:ind w:left="6480" w:hanging="360"/>
+      </w:pPr>
+      <w:rPr>
+        <w:rFonts w:ascii="Wingdings" w:hAnsi="Wingdings" w:hint="default"/>
+        <w:sz w:val="20"/>
+      </w:rPr>
+    </w:lvl>
+  </w:abstractNum>
+  <w:abstractNum w:abstractNumId="6" w15:restartNumberingAfterBreak="0">
+    <w:nsid w:val="76F01EF6"/>
+    <w:multiLevelType w:val="multilevel"/>
+    <w:tmpl w:val="E75C3D5C"/>
+    <w:lvl w:ilvl="0">
+      <w:start w:val="1"/>
+      <w:numFmt w:val="bullet"/>
+      <w:lvlText w:val=""/>
+      <w:lvlJc w:val="left"/>
+      <w:pPr>
+        <w:tabs>
+          <w:tab w:val="num" w:pos="720"/>
+        </w:tabs>
+        <w:ind w:left="720" w:hanging="360"/>
+      </w:pPr>
+      <w:rPr>
+        <w:rFonts w:ascii="Symbol" w:hAnsi="Symbol" w:hint="default"/>
+        <w:sz w:val="20"/>
+      </w:rPr>
+    </w:lvl>
+    <w:lvl w:ilvl="1" w:tentative="1">
+      <w:start w:val="1"/>
+      <w:numFmt w:val="bullet"/>
+      <w:lvlText w:val="o"/>
+      <w:lvlJc w:val="left"/>
+      <w:pPr>
+        <w:tabs>
+          <w:tab w:val="num" w:pos="1440"/>
+        </w:tabs>
+        <w:ind w:left="1440" w:hanging="360"/>
+      </w:pPr>
+      <w:rPr>
+        <w:rFonts w:ascii="Courier New" w:hAnsi="Courier New" w:hint="default"/>
+        <w:sz w:val="20"/>
+      </w:rPr>
+    </w:lvl>
+    <w:lvl w:ilvl="2" w:tentative="1">
+      <w:start w:val="1"/>
+      <w:numFmt w:val="bullet"/>
+      <w:lvlText w:val=""/>
+      <w:lvlJc w:val="left"/>
+      <w:pPr>
+        <w:tabs>
+          <w:tab w:val="num" w:pos="2160"/>
+        </w:tabs>
+        <w:ind w:left="2160" w:hanging="360"/>
+      </w:pPr>
+      <w:rPr>
+        <w:rFonts w:ascii="Wingdings" w:hAnsi="Wingdings" w:hint="default"/>
+        <w:sz w:val="20"/>
+      </w:rPr>
+    </w:lvl>
+    <w:lvl w:ilvl="3" w:tentative="1">
+      <w:start w:val="1"/>
+      <w:numFmt w:val="bullet"/>
+      <w:lvlText w:val=""/>
+      <w:lvlJc w:val="left"/>
+      <w:pPr>
+        <w:tabs>
+          <w:tab w:val="num" w:pos="2880"/>
+        </w:tabs>
+        <w:ind w:left="2880" w:hanging="360"/>
+      </w:pPr>
+      <w:rPr>
+        <w:rFonts w:ascii="Wingdings" w:hAnsi="Wingdings" w:hint="default"/>
+        <w:sz w:val="20"/>
+      </w:rPr>
+    </w:lvl>
+    <w:lvl w:ilvl="4" w:tentative="1">
+      <w:start w:val="1"/>
+      <w:numFmt w:val="bullet"/>
+      <w:lvlText w:val=""/>
+      <w:lvlJc w:val="left"/>
+      <w:pPr>
+        <w:tabs>
+          <w:tab w:val="num" w:pos="3600"/>
+        </w:tabs>
+        <w:ind w:left="3600" w:hanging="360"/>
+      </w:pPr>
+      <w:rPr>
+        <w:rFonts w:ascii="Wingdings" w:hAnsi="Wingdings" w:hint="default"/>
+        <w:sz w:val="20"/>
+      </w:rPr>
+    </w:lvl>
+    <w:lvl w:ilvl="5" w:tentative="1">
+      <w:start w:val="1"/>
+      <w:numFmt w:val="bullet"/>
+      <w:lvlText w:val=""/>
+      <w:lvlJc w:val="left"/>
+      <w:pPr>
+        <w:tabs>
+          <w:tab w:val="num" w:pos="4320"/>
+        </w:tabs>
+        <w:ind w:left="4320" w:hanging="360"/>
+      </w:pPr>
+      <w:rPr>
+        <w:rFonts w:ascii="Wingdings" w:hAnsi="Wingdings" w:hint="default"/>
+        <w:sz w:val="20"/>
+      </w:rPr>
+    </w:lvl>
+    <w:lvl w:ilvl="6" w:tentative="1">
+      <w:start w:val="1"/>
+      <w:numFmt w:val="bullet"/>
+      <w:lvlText w:val=""/>
+      <w:lvlJc w:val="left"/>
+      <w:pPr>
+        <w:tabs>
+          <w:tab w:val="num" w:pos="5040"/>
+        </w:tabs>
+        <w:ind w:left="5040" w:hanging="360"/>
+      </w:pPr>
+      <w:rPr>
+        <w:rFonts w:ascii="Wingdings" w:hAnsi="Wingdings" w:hint="default"/>
+        <w:sz w:val="20"/>
+      </w:rPr>
+    </w:lvl>
+    <w:lvl w:ilvl="7" w:tentative="1">
+      <w:start w:val="1"/>
+      <w:numFmt w:val="bullet"/>
+      <w:lvlText w:val=""/>
+      <w:lvlJc w:val="left"/>
+      <w:pPr>
+        <w:tabs>
+          <w:tab w:val="num" w:pos="5760"/>
+        </w:tabs>
+        <w:ind w:left="5760" w:hanging="360"/>
+      </w:pPr>
+      <w:rPr>
+        <w:rFonts w:ascii="Wingdings" w:hAnsi="Wingdings" w:hint="default"/>
+        <w:sz w:val="20"/>
+      </w:rPr>
+    </w:lvl>
+    <w:lvl w:ilvl="8" w:tentative="1">
+      <w:start w:val="1"/>
+      <w:numFmt w:val="bullet"/>
+      <w:lvlText w:val=""/>
+      <w:lvlJc w:val="left"/>
+      <w:pPr>
+        <w:tabs>
+          <w:tab w:val="num" w:pos="6480"/>
+        </w:tabs>
+        <w:ind w:left="6480" w:hanging="360"/>
+      </w:pPr>
+      <w:rPr>
+        <w:rFonts w:ascii="Wingdings" w:hAnsi="Wingdings" w:hint="default"/>
+        <w:sz w:val="20"/>
+      </w:rPr>
+    </w:lvl>
+  </w:abstractNum>
   <w:num w:numId="1" w16cid:durableId="1049189481">
+    <w:abstractNumId w:val="1"/>
+  </w:num>
+  <w:num w:numId="2" w16cid:durableId="848494604">
+    <w:abstractNumId w:val="3"/>
+  </w:num>
+  <w:num w:numId="3" w16cid:durableId="923565323">
+    <w:abstractNumId w:val="6"/>
+  </w:num>
+  <w:num w:numId="4" w16cid:durableId="162665741">
+    <w:abstractNumId w:val="5"/>
+  </w:num>
+  <w:num w:numId="5" w16cid:durableId="1547839365">
     <w:abstractNumId w:val="0"/>
+  </w:num>
+  <w:num w:numId="6" w16cid:durableId="1749496586">
+    <w:abstractNumId w:val="4"/>
+  </w:num>
+  <w:num w:numId="7" w16cid:durableId="595019759">
+    <w:abstractNumId w:val="2"/>
   </w:num>
 </w:numbering>
 </file>
@@ -1006,7 +2111,6 @@
   <w:style w:type="character" w:default="1" w:styleId="Policepardfaut">
     <w:name w:val="Default Paragraph Font"/>
     <w:uiPriority w:val="1"/>
-    <w:semiHidden/>
     <w:unhideWhenUsed/>
   </w:style>
   <w:style w:type="table" w:default="1" w:styleId="TableauNormal">
@@ -1317,6 +2421,29 @@
       <w:smallCaps/>
       <w:color w:val="0F4761" w:themeColor="accent1" w:themeShade="BF"/>
       <w:spacing w:val="5"/>
+    </w:rPr>
+  </w:style>
+  <w:style w:type="character" w:styleId="Lienhypertexte">
+    <w:name w:val="Hyperlink"/>
+    <w:basedOn w:val="Policepardfaut"/>
+    <w:uiPriority w:val="99"/>
+    <w:unhideWhenUsed/>
+    <w:rsid w:val="00AA43D3"/>
+    <w:rPr>
+      <w:color w:val="467886" w:themeColor="hyperlink"/>
+      <w:u w:val="single"/>
+    </w:rPr>
+  </w:style>
+  <w:style w:type="character" w:styleId="Mentionnonrsolue">
+    <w:name w:val="Unresolved Mention"/>
+    <w:basedOn w:val="Policepardfaut"/>
+    <w:uiPriority w:val="99"/>
+    <w:semiHidden/>
+    <w:unhideWhenUsed/>
+    <w:rsid w:val="00AA43D3"/>
+    <w:rPr>
+      <w:color w:val="605E5C"/>
+      <w:shd w:val="clear" w:color="auto" w:fill="E1DFDD"/>
     </w:rPr>
   </w:style>
 </w:styles>

</xml_diff>